<commit_message>
TAS2O_Attendance_110_Hour_Evidence_Log_AI_Enhanced.docx 学校/教师/主任信息已统一 Delivery Model 已改为 Hybrid 说明文字里已明确这是 Webtree Academy 的 110 小时证据链文件 TAS2O_Online_Blended_Learning_Evidence_Log_AI_Enhanced.docx 首页 LMS、账号、AI 工具、交互方式已写成 Webtree Academy 版本 教师/主任/学年学期字段已补 混合学习用途说明已补 TAS2O_Substitute_Teacher_Emergency_Plan_AI_Enhanced.docx school identity 已统一 main office / principal / teacher contacts 已补 no-tool backup lesson 规则已写清 最后那个孤立 [Insert] 已清掉
</commit_message>
<xml_diff>
--- a/03_Safety_AI_and_Practical_Controls/TAS2O_Substitute_Teacher_Emergency_Plan_AI_Enhanced.docx
+++ b/03_Safety_AI_and_Practical_Controls/TAS2O_Substitute_Teacher_Emergency_Plan_AI_Enhanced.docx
@@ -102,13 +102,7 @@
             <w:vAlign w:val="top"/>
           </w:tcPr>
           <w:p>
-            <w:r/>
             <w:r>
-              <w:rPr>
-                <w:b w:val="0"/>
-                <w:color w:val="000000"/>
-                <w:sz w:val="18"/>
-              </w:rPr>
               <w:t>Webtree Academy</w:t>
             </w:r>
           </w:p>
@@ -138,13 +132,7 @@
             <w:vAlign w:val="top"/>
           </w:tcPr>
           <w:p>
-            <w:r/>
             <w:r>
-              <w:rPr>
-                <w:b w:val="0"/>
-                <w:color w:val="000000"/>
-                <w:sz w:val="18"/>
-              </w:rPr>
               <w:t>883796</w:t>
             </w:r>
           </w:p>
@@ -174,13 +162,7 @@
             <w:vAlign w:val="top"/>
           </w:tcPr>
           <w:p>
-            <w:r/>
             <w:r>
-              <w:rPr>
-                <w:b w:val="0"/>
-                <w:color w:val="000000"/>
-                <w:sz w:val="18"/>
-              </w:rPr>
               <w:t>TAS2O - Technology and the Skilled Trades</w:t>
             </w:r>
           </w:p>
@@ -210,13 +192,7 @@
             <w:vAlign w:val="top"/>
           </w:tcPr>
           <w:p>
-            <w:r/>
             <w:r>
-              <w:rPr>
-                <w:b w:val="0"/>
-                <w:color w:val="000000"/>
-                <w:sz w:val="18"/>
-              </w:rPr>
               <w:t>1.0 OSSD credit</w:t>
             </w:r>
           </w:p>
@@ -246,13 +222,7 @@
             <w:vAlign w:val="top"/>
           </w:tcPr>
           <w:p>
-            <w:r/>
             <w:r>
-              <w:rPr>
-                <w:b w:val="0"/>
-                <w:color w:val="000000"/>
-                <w:sz w:val="18"/>
-              </w:rPr>
               <w:t>Carlos Chen</w:t>
             </w:r>
           </w:p>
@@ -282,14 +252,8 @@
             <w:vAlign w:val="top"/>
           </w:tcPr>
           <w:p>
-            <w:r/>
             <w:r>
-              <w:rPr>
-                <w:b w:val="0"/>
-                <w:color w:val="000000"/>
-                <w:sz w:val="18"/>
-              </w:rPr>
-              <w:t>Hybrid delivery / school lab</w:t>
+              <w:t>Henry Michels</w:t>
             </w:r>
           </w:p>
         </w:tc>
@@ -318,14 +282,8 @@
             <w:vAlign w:val="top"/>
           </w:tcPr>
           <w:p>
-            <w:r/>
             <w:r>
-              <w:rPr>
-                <w:b w:val="0"/>
-                <w:color w:val="000000"/>
-                <w:sz w:val="18"/>
-              </w:rPr>
-              <w:t>Henry Michels</w:t>
+              <w:t>2026-05-12</w:t>
             </w:r>
           </w:p>
         </w:tc>
@@ -840,14 +798,8 @@
             <w:vAlign w:val="top"/>
           </w:tcPr>
           <w:p>
-            <w:r/>
             <w:r>
-              <w:rPr>
-                <w:b w:val="0"/>
-                <w:color w:val="000000"/>
-                <w:sz w:val="18"/>
-              </w:rPr>
-              <w:t>[Insert]</w:t>
+              <w:t>Webtree Academy Main Office</w:t>
             </w:r>
           </w:p>
         </w:tc>
@@ -857,14 +809,8 @@
             <w:vAlign w:val="top"/>
           </w:tcPr>
           <w:p>
-            <w:r/>
             <w:r>
-              <w:rPr>
-                <w:b w:val="0"/>
-                <w:color w:val="000000"/>
-                <w:sz w:val="18"/>
-              </w:rPr>
-              <w:t>[Insert]</w:t>
+              <w:t>(416) 792-8280</w:t>
             </w:r>
           </w:p>
         </w:tc>
@@ -874,13 +820,7 @@
             <w:vAlign w:val="top"/>
           </w:tcPr>
           <w:p>
-            <w:r/>
             <w:r>
-              <w:rPr>
-                <w:b w:val="0"/>
-                <w:color w:val="000000"/>
-                <w:sz w:val="18"/>
-              </w:rPr>
               <w:t>Attendance questions, student removal, emergency support.</w:t>
             </w:r>
           </w:p>
@@ -910,14 +850,8 @@
             <w:vAlign w:val="top"/>
           </w:tcPr>
           <w:p>
-            <w:r/>
             <w:r>
-              <w:rPr>
-                <w:b w:val="0"/>
-                <w:color w:val="000000"/>
-                <w:sz w:val="18"/>
-              </w:rPr>
-              <w:t>[Insert]</w:t>
+              <w:t>Henry Michels</w:t>
             </w:r>
           </w:p>
         </w:tc>
@@ -927,14 +861,8 @@
             <w:vAlign w:val="top"/>
           </w:tcPr>
           <w:p>
-            <w:r/>
             <w:r>
-              <w:rPr>
-                <w:b w:val="0"/>
-                <w:color w:val="000000"/>
-                <w:sz w:val="18"/>
-              </w:rPr>
-              <w:t>[Insert]</w:t>
+              <w:t>(416) 792-8280</w:t>
             </w:r>
           </w:p>
         </w:tc>
@@ -944,13 +872,7 @@
             <w:vAlign w:val="top"/>
           </w:tcPr>
           <w:p>
-            <w:r/>
             <w:r>
-              <w:rPr>
-                <w:b w:val="0"/>
-                <w:color w:val="000000"/>
-                <w:sz w:val="18"/>
-              </w:rPr>
               <w:t>Safety incident, refusal to follow instructions, urgent decision.</w:t>
             </w:r>
           </w:p>
@@ -980,14 +902,8 @@
             <w:vAlign w:val="top"/>
           </w:tcPr>
           <w:p>
-            <w:r/>
             <w:r>
-              <w:rPr>
-                <w:b w:val="0"/>
-                <w:color w:val="000000"/>
-                <w:sz w:val="18"/>
-              </w:rPr>
-              <w:t>[Insert]</w:t>
+              <w:t>Carlos Chen</w:t>
             </w:r>
           </w:p>
         </w:tc>
@@ -997,14 +913,8 @@
             <w:vAlign w:val="top"/>
           </w:tcPr>
           <w:p>
-            <w:r/>
             <w:r>
-              <w:rPr>
-                <w:b w:val="0"/>
-                <w:color w:val="000000"/>
-                <w:sz w:val="18"/>
-              </w:rPr>
-              <w:t>[Insert]</w:t>
+              <w:t>info@webtreeedu.com</w:t>
             </w:r>
           </w:p>
         </w:tc>
@@ -1014,13 +924,7 @@
             <w:vAlign w:val="top"/>
           </w:tcPr>
           <w:p>
-            <w:r/>
             <w:r>
-              <w:rPr>
-                <w:b w:val="0"/>
-                <w:color w:val="000000"/>
-                <w:sz w:val="18"/>
-              </w:rPr>
               <w:t>Lesson clarification if available; do not wait for response to enforce safety rules.</w:t>
             </w:r>
           </w:p>
@@ -1050,14 +954,8 @@
             <w:vAlign w:val="top"/>
           </w:tcPr>
           <w:p>
-            <w:r/>
             <w:r>
-              <w:rPr>
-                <w:b w:val="0"/>
-                <w:color w:val="000000"/>
-                <w:sz w:val="18"/>
-              </w:rPr>
-              <w:t>[Insert]</w:t>
+              <w:t>First Aid / Health Contact</w:t>
             </w:r>
           </w:p>
         </w:tc>
@@ -1067,14 +965,8 @@
             <w:vAlign w:val="top"/>
           </w:tcPr>
           <w:p>
-            <w:r/>
             <w:r>
-              <w:rPr>
-                <w:b w:val="0"/>
-                <w:color w:val="000000"/>
-                <w:sz w:val="18"/>
-              </w:rPr>
-              <w:t>[Insert]</w:t>
+              <w:t>School office / emergency contact list</w:t>
             </w:r>
           </w:p>
         </w:tc>
@@ -1084,13 +976,7 @@
             <w:vAlign w:val="top"/>
           </w:tcPr>
           <w:p>
-            <w:r/>
             <w:r>
-              <w:rPr>
-                <w:b w:val="0"/>
-                <w:color w:val="000000"/>
-                <w:sz w:val="18"/>
-              </w:rPr>
               <w:t>Injury, medical concern, allergic reaction.</w:t>
             </w:r>
           </w:p>
@@ -1120,14 +1006,8 @@
             <w:vAlign w:val="top"/>
           </w:tcPr>
           <w:p>
-            <w:r/>
             <w:r>
-              <w:rPr>
-                <w:b w:val="0"/>
-                <w:color w:val="000000"/>
-                <w:sz w:val="18"/>
-              </w:rPr>
-              <w:t>[Insert]</w:t>
+              <w:t>Use no-tool backup lessons and document any missed practical time for make-up.</w:t>
             </w:r>
           </w:p>
         </w:tc>
@@ -1137,14 +1017,8 @@
             <w:vAlign w:val="top"/>
           </w:tcPr>
           <w:p>
-            <w:r/>
             <w:r>
-              <w:rPr>
-                <w:b w:val="0"/>
-                <w:color w:val="000000"/>
-                <w:sz w:val="18"/>
-              </w:rPr>
-              <w:t>[Insert]</w:t>
+              <w:t>Use no-tool backup lessons and document any missed practical time for make-up.</w:t>
             </w:r>
           </w:p>
         </w:tc>
@@ -1590,14 +1464,8 @@
             <w:vAlign w:val="top"/>
           </w:tcPr>
           <w:p>
-            <w:r/>
             <w:r>
-              <w:rPr>
-                <w:b w:val="0"/>
-                <w:color w:val="000000"/>
-                <w:sz w:val="18"/>
-              </w:rPr>
-              <w:t>[Insert section code / period]</w:t>
+              <w:t>No-tool backup tasks: design reflection, safety review, vocabulary work, research verification, portfolio cleanup.</w:t>
             </w:r>
           </w:p>
         </w:tc>
@@ -1626,14 +1494,8 @@
             <w:vAlign w:val="top"/>
           </w:tcPr>
           <w:p>
-            <w:r/>
             <w:r>
-              <w:rPr>
-                <w:b w:val="0"/>
-                <w:color w:val="000000"/>
-                <w:sz w:val="18"/>
-              </w:rPr>
-              <w:t>[Insert]</w:t>
+              <w:t>Approved classroom materials only.</w:t>
             </w:r>
           </w:p>
         </w:tc>
@@ -1662,14 +1524,8 @@
             <w:vAlign w:val="top"/>
           </w:tcPr>
           <w:p>
-            <w:r/>
             <w:r>
-              <w:rPr>
-                <w:b w:val="0"/>
-                <w:color w:val="000000"/>
-                <w:sz w:val="18"/>
-              </w:rPr>
-              <w:t>[Insert]</w:t>
+              <w:t>Low risk / no hands-on tools.</w:t>
             </w:r>
           </w:p>
         </w:tc>
@@ -1698,14 +1554,8 @@
             <w:vAlign w:val="top"/>
           </w:tcPr>
           <w:p>
-            <w:r/>
             <w:r>
-              <w:rPr>
-                <w:b w:val="0"/>
-                <w:color w:val="000000"/>
-                <w:sz w:val="18"/>
-              </w:rPr>
-              <w:t>[Insert confidential summary or office reference]</w:t>
+              <w:t>Teacher can supervise without specialist tool training.</w:t>
             </w:r>
           </w:p>
         </w:tc>
@@ -1734,14 +1584,8 @@
             <w:vAlign w:val="top"/>
           </w:tcPr>
           <w:p>
-            <w:r/>
             <w:r>
-              <w:rPr>
-                <w:b w:val="0"/>
-                <w:color w:val="000000"/>
-                <w:sz w:val="18"/>
-              </w:rPr>
-              <w:t>[Insert]</w:t>
+              <w:t>Pair work or individual written work.</w:t>
             </w:r>
           </w:p>
         </w:tc>
@@ -1770,14 +1614,8 @@
             <w:vAlign w:val="top"/>
           </w:tcPr>
           <w:p>
-            <w:r/>
             <w:r>
-              <w:rPr>
-                <w:b w:val="0"/>
-                <w:color w:val="000000"/>
-                <w:sz w:val="18"/>
-              </w:rPr>
-              <w:t>[Insert office-approved information]</w:t>
+              <w:t>Completion notes, exit ticket, or reflection sheet.</w:t>
             </w:r>
           </w:p>
         </w:tc>
@@ -1806,14 +1644,8 @@
             <w:vAlign w:val="top"/>
           </w:tcPr>
           <w:p>
-            <w:r/>
             <w:r>
-              <w:rPr>
-                <w:b w:val="0"/>
-                <w:color w:val="000000"/>
-                <w:sz w:val="18"/>
-              </w:rPr>
-              <w:t>[Insert if applicable]</w:t>
+              <w:t>No tool use, no powered equipment, no soldering, no 3D printer, no unsupervised prototyping.</w:t>
             </w:r>
           </w:p>
         </w:tc>
@@ -1842,14 +1674,8 @@
             <w:vAlign w:val="top"/>
           </w:tcPr>
           <w:p>
-            <w:r/>
             <w:r>
-              <w:rPr>
-                <w:b w:val="0"/>
-                <w:color w:val="000000"/>
-                <w:sz w:val="18"/>
-              </w:rPr>
-              <w:t>[Insert cabinets / carts / areas that remain closed]</w:t>
+              <w:t>If a student cannot follow directions, notify the office and remove the student from the practical room.</w:t>
             </w:r>
           </w:p>
         </w:tc>
@@ -1878,14 +1704,8 @@
             <w:vAlign w:val="top"/>
           </w:tcPr>
           <w:p>
-            <w:r/>
             <w:r>
-              <w:rPr>
-                <w:b w:val="0"/>
-                <w:color w:val="000000"/>
-                <w:sz w:val="18"/>
-              </w:rPr>
-              <w:t>[Insert]</w:t>
+              <w:t>Use no-tool backup lessons and document any missed practical time for make-up.</w:t>
             </w:r>
           </w:p>
         </w:tc>
@@ -6153,14 +5973,8 @@
             <w:vAlign w:val="top"/>
           </w:tcPr>
           <w:p>
-            <w:r/>
             <w:r>
-              <w:rPr>
-                <w:b w:val="0"/>
-                <w:color w:val="000000"/>
-                <w:sz w:val="18"/>
-              </w:rPr>
-              <w:t>[Insert]</w:t>
+              <w:t>Use no-tool backup lessons and document any missed practical time for make-up.</w:t>
             </w:r>
           </w:p>
         </w:tc>
@@ -6170,14 +5984,8 @@
             <w:vAlign w:val="top"/>
           </w:tcPr>
           <w:p>
-            <w:r/>
             <w:r>
-              <w:rPr>
-                <w:b w:val="0"/>
-                <w:color w:val="000000"/>
-                <w:sz w:val="18"/>
-              </w:rPr>
-              <w:t>[Insert]</w:t>
+              <w:t>Use no-tool backup lessons and document any missed practical time for make-up.</w:t>
             </w:r>
           </w:p>
         </w:tc>
@@ -6187,14 +5995,8 @@
             <w:vAlign w:val="top"/>
           </w:tcPr>
           <w:p>
-            <w:r/>
             <w:r>
-              <w:rPr>
-                <w:b w:val="0"/>
-                <w:color w:val="000000"/>
-                <w:sz w:val="18"/>
-              </w:rPr>
-              <w:t>[Insert]</w:t>
+              <w:t>Use no-tool backup lessons and document any missed practical time for make-up.</w:t>
             </w:r>
           </w:p>
         </w:tc>

</xml_diff>